<commit_message>
Update changelog and Engineering Manager resume: rebalance resume layout, sync with strengthened evidence, and remove Markdown emphasis from key technologies.
</commit_message>
<xml_diff>
--- a/resumes/engineering-manager/resume.docx
+++ b/resumes/engineering-manager/resume.docx
@@ -299,22 +299,6 @@
       </w:r>
       <w:r>
         <w:t>Led backend engineering activities for an Election Management System, including task allocation, grooming, planning, implementation guidance, and code reviews within a 30-person development team.</w:t>
-      </w:r>
-    </w:p>
-    <w:p>
-      <w:pPr>
-        <w:spacing w:after="36" w:line="245" w:lineRule="auto"/>
-        <w:ind w:left="245" w:hanging="187"/>
-        <w:keepLines/>
-      </w:pPr>
-      <w:r>
-        <w:rPr>
-          <w:color w:val="1B375C"/>
-        </w:rPr>
-        <w:t xml:space="preserve">•  </w:t>
-      </w:r>
-      <w:r>
-        <w:t>Key technologies: Java, Spring Boot, Hibernate, REST APIs, Docker, Kubernetes, Keycloak.</w:t>
       </w:r>
     </w:p>
     <w:p>

</xml_diff>